<commit_message>
feat: legal candidates can be tested by standard evaluators via classic oral flow
</commit_message>
<xml_diff>
--- a/data/conventions/convention_2000dc047290c83c46f384b2079373a4bcc3ee42.docx
+++ b/data/conventions/convention_2000dc047290c83c46f384b2079373a4bcc3ee42.docx
@@ -132,7 +132,27 @@
           <w:szCs w:val="19"/>
           <w:lang w:val="fr-FR"/>
         </w:rPr>
-        <w:t xml:space="preserve">Et Cornet Vincent Ségurel, SIRET , est conclue la convention suivante, en application des dispositions du Livre III de la sixième partie du code du travail portant organisation de la formation professionnelle. </w:t>
+        <w:t xml:space="preserve">Et </w:t>
+      </w:r>
+      <w:r>
+        <w:rPr>
+          <w:rFonts w:ascii="Avenir Next Regular" w:eastAsia="Calibri" w:hAnsi="Avenir Next Regular" w:cs="Browallia New"/>
+          <w:b/>
+          <w:bCs/>
+          <w:sz w:val="19"/>
+          <w:szCs w:val="19"/>
+          <w:lang w:val="fr-FR"/>
+        </w:rPr>
+        <w:t>Cornet Vincent Ségurel, SIRET 344 040 647 00093,</w:t>
+      </w:r>
+      <w:r>
+        <w:rPr>
+          <w:rFonts w:ascii="Avenir Next Regular" w:eastAsia="Calibri" w:hAnsi="Avenir Next Regular" w:cs="Browallia New"/>
+          <w:sz w:val="19"/>
+          <w:szCs w:val="19"/>
+          <w:lang w:val="fr-FR"/>
+        </w:rPr>
+        <w:t xml:space="preserve"> est conclue la convention suivante, en application des dispositions du Livre III de la sixième partie du code du travail portant organisation de la formation professionnelle. </w:t>
       </w:r>
     </w:p>
     <w:p>
@@ -276,7 +296,18 @@
           <w:szCs w:val="19"/>
           <w:lang w:val="fr-FR"/>
         </w:rPr>
-        <w:t>Intitulé de l’action : Formation en Anglais Professionnel</w:t>
+        <w:t xml:space="preserve">Intitulé de l’action : </w:t>
+      </w:r>
+      <w:r>
+        <w:rPr>
+          <w:rFonts w:ascii="Avenir Next Regular" w:eastAsia="Calibri" w:hAnsi="Avenir Next Regular" w:cs="Browallia New"/>
+          <w:b/>
+          <w:bCs/>
+          <w:sz w:val="19"/>
+          <w:szCs w:val="19"/>
+          <w:lang w:val="fr-FR"/>
+        </w:rPr>
+        <w:t>Formation en Anglais Juridique</w:t>
       </w:r>
     </w:p>
     <w:p>
@@ -334,6 +365,8 @@
         <w:ind w:left="426" w:right="-431"/>
         <w:rPr>
           <w:rFonts w:ascii="Avenir Next Regular" w:eastAsia="Calibri" w:hAnsi="Avenir Next Regular" w:cs="Browallia New"/>
+          <w:b/>
+          <w:bCs/>
           <w:sz w:val="19"/>
           <w:szCs w:val="19"/>
           <w:lang w:val="fr-FR"/>
@@ -346,7 +379,18 @@
           <w:szCs w:val="19"/>
           <w:lang w:val="fr-FR"/>
         </w:rPr>
-        <w:t>Durée de l’action de formation : 20 heures (20h formation + 0h travail autonome) heures</w:t>
+        <w:t xml:space="preserve">Durée de l’action de formation : </w:t>
+      </w:r>
+      <w:r>
+        <w:rPr>
+          <w:rFonts w:ascii="Avenir Next Regular" w:eastAsia="Calibri" w:hAnsi="Avenir Next Regular" w:cs="Browallia New"/>
+          <w:b/>
+          <w:bCs/>
+          <w:sz w:val="19"/>
+          <w:szCs w:val="19"/>
+          <w:lang w:val="fr-FR"/>
+        </w:rPr>
+        <w:t>20 heures</w:t>
       </w:r>
     </w:p>
     <w:p>
@@ -408,7 +452,18 @@
           <w:szCs w:val="19"/>
           <w:lang w:val="fr-FR"/>
         </w:rPr>
-        <w:t>Dates : du 22 juin 2026 au 31 décembre 2026</w:t>
+        <w:t xml:space="preserve">Dates : </w:t>
+      </w:r>
+      <w:r>
+        <w:rPr>
+          <w:rFonts w:ascii="Avenir Next Regular" w:eastAsia="Calibri" w:hAnsi="Avenir Next Regular" w:cs="Browallia New"/>
+          <w:b/>
+          <w:bCs/>
+          <w:sz w:val="19"/>
+          <w:szCs w:val="19"/>
+          <w:lang w:val="fr-FR"/>
+        </w:rPr>
+        <w:t>du 22 juin 2026 au 31 décembre 2026</w:t>
       </w:r>
     </w:p>
     <w:p>
@@ -469,7 +524,7 @@
           <w:szCs w:val="19"/>
           <w:lang w:val="fr-FR"/>
         </w:rPr>
-        <w:t>Prérequis : B1 (2)</w:t>
+        <w:t xml:space="preserve">Prérequis : </w:t>
       </w:r>
       <w:r>
         <w:rPr>
@@ -480,41 +535,7 @@
           <w:szCs w:val="19"/>
           <w:lang w:val="fr-FR"/>
         </w:rPr>
-      </w:r>
-    </w:p>
-    <w:p>
-      <w:pPr>
-        <w:pStyle w:val="Normal10"/>
-        <w:numPr>
-          <w:ilvl w:val="0"/>
-          <w:numId w:val="34"/>
-        </w:numPr>
-        <w:ind w:left="426" w:right="-431"/>
-        <w:rPr>
-          <w:rFonts w:ascii="Avenir Next Regular" w:eastAsia="Calibri" w:hAnsi="Avenir Next Regular" w:cs="Browallia New"/>
-          <w:sz w:val="19"/>
-          <w:szCs w:val="19"/>
-          <w:lang w:val="fr-FR"/>
-        </w:rPr>
-      </w:pPr>
-      <w:r>
-        <w:rPr>
-          <w:rFonts w:ascii="Avenir Next Regular" w:eastAsia="Calibri" w:hAnsi="Avenir Next Regular" w:cs="Browallia New"/>
-          <w:sz w:val="19"/>
-          <w:szCs w:val="19"/>
-          <w:lang w:val="fr-FR"/>
-        </w:rPr>
-        <w:t>Niveau visé : C1+ (4,5)</w:t>
-      </w:r>
-      <w:r>
-        <w:rPr>
-          <w:rFonts w:ascii="Avenir Next Regular" w:eastAsia="Calibri" w:hAnsi="Avenir Next Regular" w:cs="Browallia New"/>
-          <w:b/>
-          <w:bCs/>
-          <w:sz w:val="19"/>
-          <w:szCs w:val="19"/>
-          <w:lang w:val="fr-FR"/>
-        </w:rPr>
+        <w:t>B1 (2)</w:t>
       </w:r>
     </w:p>
     <w:p>
@@ -725,7 +746,27 @@
           <w:szCs w:val="19"/>
           <w:lang w:val="fr-FR"/>
         </w:rPr>
-        <w:t>Les frais de formation sont : 2640 EUROS NET DE TAXES* à payer à réception de facture. Un cofinancement ou abondement est également possible du moment que l’accord de prise en charge est donné avant démarrage de la formation. Les tarifs comprennent les frais pédagogiques. (*Conformément à l'article 261-4-4° du Code général des impôts, nos activités de formation professionnelle continue sont exonérées de T.V.A.)</w:t>
+        <w:t xml:space="preserve">Les frais de formation sont : </w:t>
+      </w:r>
+      <w:r>
+        <w:rPr>
+          <w:rFonts w:ascii="Avenir Next Regular" w:eastAsia="Calibri" w:hAnsi="Avenir Next Regular" w:cs="Browallia New"/>
+          <w:sz w:val="19"/>
+          <w:szCs w:val="19"/>
+          <w:lang w:val="fr-FR"/>
+          <w:b/>
+          <w:bCs/>
+        </w:rPr>
+        <w:t>2640 EUROS NET DE TAXES*</w:t>
+      </w:r>
+      <w:r>
+        <w:rPr>
+          <w:rFonts w:ascii="Avenir Next Regular" w:eastAsia="Calibri" w:hAnsi="Avenir Next Regular" w:cs="Browallia New"/>
+          <w:sz w:val="19"/>
+          <w:szCs w:val="19"/>
+          <w:lang w:val="fr-FR"/>
+        </w:rPr>
+        <w:t xml:space="preserve"> à payer à réception de facture. Un cofinancement ou abondement est également possible du moment que l’accord de prise en charge est donné avant démarrage de la formation. Les tarifs comprennent les frais pédagogiques. (*Conformément à l'article 261-4-4° du Code général des impôts, nos activités de formation professionnelle continue sont exonérées de T.V.A.)</w:t>
       </w:r>
     </w:p>
     <w:p>
@@ -1164,34 +1205,7 @@
           <w:szCs w:val="19"/>
           <w:lang w:val="fr-FR"/>
         </w:rPr>
-        <w:t>Fait en double exemplaire, à Saint-Cyprien le 10 juin 2026</w:t>
-        <w:tab/>
-        <w:tab/>
-        <w:tab/>
-      </w:r>
-      <w:r>
-        <w:rPr>
-          <w:rFonts w:ascii="Avenir Next Regular" w:eastAsia="Calibri" w:hAnsi="Avenir Next Regular" w:cs="Browallia New"/>
-          <w:sz w:val="19"/>
-          <w:szCs w:val="19"/>
-          <w:lang w:val="fr-FR"/>
-        </w:rPr>
-      </w:r>
-      <w:r>
-        <w:rPr>
-          <w:rFonts w:ascii="Avenir Next Regular" w:eastAsia="Calibri" w:hAnsi="Avenir Next Regular" w:cs="Browallia New"/>
-          <w:sz w:val="19"/>
-          <w:szCs w:val="19"/>
-          <w:lang w:val="fr-FR"/>
-        </w:rPr>
-      </w:r>
-      <w:r>
-        <w:rPr>
-          <w:rFonts w:ascii="Avenir Next Regular" w:eastAsia="Calibri" w:hAnsi="Avenir Next Regular" w:cs="Browallia New"/>
-          <w:sz w:val="19"/>
-          <w:szCs w:val="19"/>
-          <w:lang w:val="fr-FR"/>
-        </w:rPr>
+        <w:t>Fait en double exemplaire, à Saint-Cyprien le 2 juillet 2026</w:t>
       </w:r>
     </w:p>
     <w:p>
@@ -1206,97 +1220,166 @@
         </w:rPr>
       </w:pPr>
     </w:p>
-    <w:p>
-      <w:pPr>
-        <w:pStyle w:val="Normal10"/>
-        <w:ind w:left="-426" w:right="-431"/>
-        <w:rPr>
-          <w:rFonts w:ascii="Avenir Next Regular" w:hAnsi="Avenir Next Regular"/>
-          <w:b/>
-          <w:bCs/>
-          <w:color w:val="1F497D" w:themeColor="text2"/>
-          <w:lang w:val="fr-FR"/>
-        </w:rPr>
-        <w:sectPr>
-          <w:type w:val="continuous"/>
-          <w:pgSz w:w="11900" w:h="16820" w:code="297"/>
-          <w:pgMar w:top="1560" w:right="1274" w:bottom="1005" w:left="1418" w:header="0" w:footer="1106" w:gutter="0"/>
-          <w:cols w:space="708"/>
-          <w:docGrid w:linePitch="360"/>
-        </w:sectPr>
-      </w:pPr>
-      <w:r>
-        <w:rPr>
-          <w:rFonts w:ascii="Avenir Next Regular" w:hAnsi="Avenir Next Regular"/>
-          <w:b/>
-          <w:bCs/>
-          <w:color w:val="1F497D" w:themeColor="text2"/>
-          <w:lang w:val="fr-FR"/>
-        </w:rPr>
-        <w:t>Pour Cornet Vincent Ségurel</w:t>
-        <w:tab/>
-        <w:tab/>
-        <w:tab/>
-        <w:tab/>
-        <w:tab/>
-        <w:tab/>
-        <w:t>Pour l’organisme LINGUAID FRANCE</w:t>
-      </w:r>
-      <w:r>
-        <w:rPr>
-          <w:rFonts w:ascii="Avenir Next Regular" w:hAnsi="Avenir Next Regular"/>
-          <w:b/>
-          <w:bCs/>
-          <w:color w:val="1F497D" w:themeColor="text2"/>
-          <w:lang w:val="fr-FR"/>
-        </w:rPr>
-      </w:r>
-      <w:r>
-        <w:rPr>
-          <w:rFonts w:ascii="Avenir Next Regular" w:hAnsi="Avenir Next Regular"/>
-          <w:b/>
-          <w:bCs/>
-          <w:color w:val="1F497D" w:themeColor="text2"/>
-          <w:lang w:val="fr-FR"/>
-        </w:rPr>
-      </w:r>
-      <w:r>
-        <w:rPr>
-          <w:rFonts w:ascii="Avenir Next Regular" w:hAnsi="Avenir Next Regular"/>
-          <w:b/>
-          <w:bCs/>
-          <w:color w:val="1F497D" w:themeColor="text2"/>
-          <w:lang w:val="fr-FR"/>
-        </w:rPr>
-      </w:r>
-      <w:r>
-        <w:rPr>
-          <w:rFonts w:ascii="Avenir Next Regular" w:hAnsi="Avenir Next Regular"/>
-          <w:b/>
-          <w:bCs/>
-          <w:color w:val="1F497D" w:themeColor="text2"/>
-          <w:lang w:val="fr-FR"/>
-        </w:rPr>
-      </w:r>
-      <w:r>
-        <w:rPr>
-          <w:rFonts w:ascii="Avenir Next Regular" w:hAnsi="Avenir Next Regular"/>
-          <w:b/>
-          <w:bCs/>
-          <w:color w:val="1F497D" w:themeColor="text2"/>
-          <w:lang w:val="fr-FR"/>
-        </w:rPr>
-      </w:r>
-      <w:r>
-        <w:rPr>
-          <w:rFonts w:ascii="Avenir Next Regular" w:hAnsi="Avenir Next Regular"/>
-          <w:b/>
-          <w:bCs/>
-          <w:color w:val="1F497D" w:themeColor="text2"/>
-          <w:lang w:val="fr-FR"/>
-        </w:rPr>
-      </w:r>
-    </w:p>
+    <w:tbl>
+      <w:tblPr>
+        <w:tblW w:w="9360" w:type="dxa"/>
+        <w:tblLook w:val="04A0" w:firstRow="1" w:lastRow="0" w:firstColumn="1" w:lastColumn="0" w:noHBand="0" w:noVBand="1"/>
+      </w:tblPr>
+      <w:tblGrid>
+        <w:gridCol w:w="4680"/>
+        <w:gridCol w:w="4680"/>
+      </w:tblGrid>
+      <w:tr>
+        <w:tc>
+          <w:tcPr>
+            <w:tcW w:w="4680" w:type="dxa"/>
+          </w:tcPr>
+          <w:p>
+            <w:pPr>
+              <w:spacing w:after="120"/>
+            </w:pPr>
+            <w:r>
+              <w:rPr>
+                <w:rFonts w:ascii="Avenir Next Regular" w:hAnsi="Avenir Next Regular"/>
+                <w:b/>
+                <w:bCs/>
+                <w:color w:val="1F497D" w:themeColor="text2"/>
+              </w:rPr>
+              <w:t>Pour Cornet Vincent Ségurel</w:t>
+            </w:r>
+          </w:p>
+        </w:tc>
+        <w:tc>
+          <w:tcPr>
+            <w:tcW w:w="4680" w:type="dxa"/>
+          </w:tcPr>
+          <w:p>
+            <w:pPr>
+              <w:spacing w:after="120"/>
+            </w:pPr>
+            <w:r>
+              <w:rPr>
+                <w:rFonts w:ascii="Avenir Next Regular" w:hAnsi="Avenir Next Regular"/>
+                <w:b/>
+                <w:bCs/>
+                <w:color w:val="1F497D" w:themeColor="text2"/>
+              </w:rPr>
+              <w:t>Pour l’organisme LINGUAID FRANCE</w:t>
+            </w:r>
+          </w:p>
+        </w:tc>
+      </w:tr>
+      <w:tr>
+        <w:tc>
+          <w:tcPr>
+            <w:tcW w:w="4680" w:type="dxa"/>
+          </w:tcPr>
+          <w:p>
+            <w:pPr>
+              <w:spacing w:after="120"/>
+            </w:pPr>
+          </w:p>
+        </w:tc>
+        <w:tc>
+          <w:tcPr>
+            <w:tcW w:w="4680" w:type="dxa"/>
+          </w:tcPr>
+          <w:p>
+            <w:pPr>
+              <w:spacing w:after="120"/>
+            </w:pPr>
+          </w:p>
+        </w:tc>
+      </w:tr>
+      <w:tr>
+        <w:tc>
+          <w:tcPr>
+            <w:tcW w:w="4680" w:type="dxa"/>
+          </w:tcPr>
+          <w:p>
+            <w:pPr>
+              <w:spacing w:after="120"/>
+            </w:pPr>
+          </w:p>
+        </w:tc>
+        <w:tc>
+          <w:tcPr>
+            <w:tcW w:w="4680" w:type="dxa"/>
+          </w:tcPr>
+          <w:p>
+            <w:pPr>
+              <w:spacing w:after="120"/>
+            </w:pPr>
+          </w:p>
+        </w:tc>
+      </w:tr>
+      <w:tr>
+        <w:tc>
+          <w:tcPr>
+            <w:tcW w:w="4680" w:type="dxa"/>
+          </w:tcPr>
+          <w:p>
+            <w:pPr>
+              <w:spacing w:after="120"/>
+            </w:pPr>
+          </w:p>
+        </w:tc>
+        <w:tc>
+          <w:tcPr>
+            <w:tcW w:w="4680" w:type="dxa"/>
+          </w:tcPr>
+          <w:p>
+            <w:pPr>
+              <w:spacing w:after="120"/>
+            </w:pPr>
+          </w:p>
+        </w:tc>
+      </w:tr>
+      <w:tr>
+        <w:tc>
+          <w:tcPr>
+            <w:tcW w:w="4680" w:type="dxa"/>
+          </w:tcPr>
+          <w:p>
+            <w:pPr>
+              <w:spacing w:after="120"/>
+            </w:pPr>
+          </w:p>
+        </w:tc>
+        <w:tc>
+          <w:tcPr>
+            <w:tcW w:w="4680" w:type="dxa"/>
+          </w:tcPr>
+          <w:p>
+            <w:pPr>
+              <w:spacing w:after="120"/>
+            </w:pPr>
+          </w:p>
+        </w:tc>
+      </w:tr>
+      <w:tr>
+        <w:tc>
+          <w:tcPr>
+            <w:tcW w:w="4680" w:type="dxa"/>
+          </w:tcPr>
+          <w:p>
+            <w:pPr>
+              <w:spacing w:after="120"/>
+            </w:pPr>
+          </w:p>
+        </w:tc>
+        <w:tc>
+          <w:tcPr>
+            <w:tcW w:w="4680" w:type="dxa"/>
+          </w:tcPr>
+          <w:p>
+            <w:pPr>
+              <w:spacing w:after="120"/>
+            </w:pPr>
+          </w:p>
+        </w:tc>
+      </w:tr>
+    </w:tbl>
     <w:p>
       <w:pPr>
         <w:pStyle w:val="Normal10"/>
@@ -1451,14 +1534,14 @@
                       </a:ln>
                       <a:extLst>
                         <a:ext uri="{909E8E84-426E-40dd-AFC4-6F175D3DCCD1}">
-                          <a14:hiddenFill xmlns:a14="http://schemas.microsoft.com/office/drawing/2010/main" xmlns:w="http://schemas.openxmlformats.org/wordprocessingml/2006/main" xmlns:w10="urn:schemas-microsoft-com:office:word" xmlns:v="urn:schemas-microsoft-com:vml" xmlns:o="urn:schemas-microsoft-com:office:office" xmlns:mv="urn:schemas-microsoft-com:mac:vml" xmlns:mo="http://schemas.microsoft.com/office/mac/office/2008/main" xmlns="">
+                          <a14:hiddenFill xmlns="" xmlns:mo="http://schemas.microsoft.com/office/mac/office/2008/main" xmlns:mv="urn:schemas-microsoft-com:mac:vml" xmlns:o="urn:schemas-microsoft-com:office:office" xmlns:v="urn:schemas-microsoft-com:vml" xmlns:w10="urn:schemas-microsoft-com:office:word" xmlns:w="http://schemas.openxmlformats.org/wordprocessingml/2006/main" xmlns:a14="http://schemas.microsoft.com/office/drawing/2010/main">
                             <a:solidFill>
                               <a:srgbClr val="00CC99"/>
                             </a:solidFill>
                           </a14:hiddenFill>
                         </a:ext>
                         <a:ext uri="{91240B29-F687-4f45-9708-019B960494DF}">
-                          <a14:hiddenLine xmlns:a14="http://schemas.microsoft.com/office/drawing/2010/main" xmlns:w="http://schemas.openxmlformats.org/wordprocessingml/2006/main" xmlns:w10="urn:schemas-microsoft-com:office:word" xmlns:v="urn:schemas-microsoft-com:vml" xmlns:o="urn:schemas-microsoft-com:office:office" xmlns:mv="urn:schemas-microsoft-com:mac:vml" xmlns:mo="http://schemas.microsoft.com/office/mac/office/2008/main" xmlns="" w="9525">
+                          <a14:hiddenLine xmlns="" xmlns:mo="http://schemas.microsoft.com/office/mac/office/2008/main" xmlns:mv="urn:schemas-microsoft-com:mac:vml" xmlns:o="urn:schemas-microsoft-com:office:office" xmlns:v="urn:schemas-microsoft-com:vml" xmlns:w10="urn:schemas-microsoft-com:office:word" xmlns:w="http://schemas.openxmlformats.org/wordprocessingml/2006/main" xmlns:a14="http://schemas.microsoft.com/office/drawing/2010/main" w="9525">
                             <a:solidFill>
                               <a:srgbClr val="000000"/>
                             </a:solidFill>
@@ -1865,14 +1948,14 @@
                       </a:ln>
                       <a:extLst>
                         <a:ext uri="{909E8E84-426E-40dd-AFC4-6F175D3DCCD1}">
-                          <a14:hiddenFill xmlns:a14="http://schemas.microsoft.com/office/drawing/2010/main" xmlns:w="http://schemas.openxmlformats.org/wordprocessingml/2006/main" xmlns:w10="urn:schemas-microsoft-com:office:word" xmlns:v="urn:schemas-microsoft-com:vml" xmlns:o="urn:schemas-microsoft-com:office:office" xmlns:mv="urn:schemas-microsoft-com:mac:vml" xmlns:mo="http://schemas.microsoft.com/office/mac/office/2008/main" xmlns="">
+                          <a14:hiddenFill xmlns="" xmlns:mo="http://schemas.microsoft.com/office/mac/office/2008/main" xmlns:mv="urn:schemas-microsoft-com:mac:vml" xmlns:o="urn:schemas-microsoft-com:office:office" xmlns:v="urn:schemas-microsoft-com:vml" xmlns:w10="urn:schemas-microsoft-com:office:word" xmlns:w="http://schemas.openxmlformats.org/wordprocessingml/2006/main" xmlns:a14="http://schemas.microsoft.com/office/drawing/2010/main">
                             <a:solidFill>
                               <a:srgbClr val="00CC99"/>
                             </a:solidFill>
                           </a14:hiddenFill>
                         </a:ext>
                         <a:ext uri="{91240B29-F687-4f45-9708-019B960494DF}">
-                          <a14:hiddenLine xmlns:a14="http://schemas.microsoft.com/office/drawing/2010/main" xmlns:w="http://schemas.openxmlformats.org/wordprocessingml/2006/main" xmlns:w10="urn:schemas-microsoft-com:office:word" xmlns:v="urn:schemas-microsoft-com:vml" xmlns:o="urn:schemas-microsoft-com:office:office" xmlns:mv="urn:schemas-microsoft-com:mac:vml" xmlns:mo="http://schemas.microsoft.com/office/mac/office/2008/main" xmlns="" w="9525">
+                          <a14:hiddenLine xmlns="" xmlns:mo="http://schemas.microsoft.com/office/mac/office/2008/main" xmlns:mv="urn:schemas-microsoft-com:mac:vml" xmlns:o="urn:schemas-microsoft-com:office:office" xmlns:v="urn:schemas-microsoft-com:vml" xmlns:w10="urn:schemas-microsoft-com:office:word" xmlns:w="http://schemas.openxmlformats.org/wordprocessingml/2006/main" xmlns:a14="http://schemas.microsoft.com/office/drawing/2010/main" w="9525">
                             <a:solidFill>
                               <a:srgbClr val="000000"/>
                             </a:solidFill>

</xml_diff>